<commit_message>
Add GOST/UML diagram skill and trim UI copy
Introduces a new reusable `gost-uml-diagram` agent skill with generation helpers, strict style rules, and a full `diagram_examples_v1` SVG gallery plus browser preview. Updates repository agent guidance (document/PDF tooling and cleanup rules), and streamlines Sokoban web copy/layout by shortening descriptive text, tightening complexity labels, and adjusting FlyBrain viewer styling/content. Also refreshes course-report deliverables by reorganizing/renaming final DOCX/PDF artifacts and adding related supporting files.
</commit_message>
<xml_diff>
--- a/CURSOVA/ALG_AND_STR 2026 2Kurs/CURSOVA/Курсова_робота_Сокобан_Коваль.docx
+++ b/CURSOVA/ALG_AND_STR 2026 2Kurs/CURSOVA/Курсова_робота_Сокобан_Коваль.docx
@@ -1711,7 +1711,7 @@
         <w:rPr>
           <w:rFonts w:cs="Times New Roman"/>
         </w:rPr>
-        <w:t>Для даної курсової роботи були розроблені алгоритми пошуку розв’язку гри «Сокобан» у просторі станів: алгоритм пошуку в ширину (BFS) та евристичний алгоритм A* з макроштовханнями, зворотними push-відстанями, мінімальним призначенням ящиків цілям (Угорський алгоритм) та безпечним виявленням тупикових станів (Deadlock Detection). Алгоритми є повними, тому завжди знаходять розв’язок, якщо він існує, а A* додатково гарантує оптимальність за обраною метрикою (кількість ходів або штовхань).</w:t>
+        <w:t>Для даної курсової роботи були розроблені алгоритми пошуку розв’язку гри «Сокобан» у просторі станів: алгоритм пошуку в ширину (BFS) та евристичний алгоритм A* з макроштовханнями, зворотними push-відстанями, мінімальним призначенням ящиків цілям (Угорський алгоритм) та безпечним виявленням тупикових станів (Deadlock Detection). Алгоритми є повними, тому завжди знаходять розв’язок, якщо він існує, а A* додатково гарантує оптимальність за обраною метрикою (кількість ходів або штовхань). Окрім базових BFS та A*, ядро містить IDA*, жадібний пошук, навчальний прототип X→Y та популяційні методи ACO, GA, Drain і Cannibal GA; браузерна версія додатково надає біо-агента FlyBrain і зовнішній ШІ (Groq/Google), а всі дванадцять алгоритмів в інтерфейсі пронумеровано від 1 до 12.</w:t>
       </w:r>
     </w:p>
     <w:p>
@@ -1723,7 +1723,7 @@
         <w:rPr>
           <w:rFonts w:cs="Times New Roman"/>
         </w:rPr>
-        <w:t>Програмна реалізація завдання була створена на мові програмування C++20, що забезпечує високу продуктивність пошуку та можливість повторного використання ядра в різних інтерфейсах. Термінальний інтерфейс реалізовано як консольний застосунок з ANSI-візуалізацією, браузерна версія – на Next.js/React з WebAssembly-мостом. Проект збирається за допомогою CMake, використано середовище розробки Visual Studio Code та компілятор MinGW-w64.</w:t>
+        <w:t>Програмна реалізація завдання була створена на мові програмування C++20, що забезпечує високу продуктивність пошуку та можливість повторного використання ядра в різних інтерфейсах. Термінальний інтерфейс реалізовано як консольний застосунок з ANSI-візуалізацією, браузерна версія – на Next.js/React із нативним процесом-мостом sokoban_web, що виконує те саме C++-ядро через JSON-протокол. Проект збирається за допомогою CMake, використано середовище розробки Visual Studio Code та компілятор MinGW-w64.</w:t>
       </w:r>
     </w:p>
     <w:p>
@@ -2264,7 +2264,7 @@
                 <w:szCs w:val="28"/>
                 <w:lang w:val="uk-UA"/>
               </w:rPr>
-              <w:t>21</w:t>
+              <w:t>22</w:t>
             </w:r>
           </w:p>
         </w:tc>
@@ -2309,7 +2309,7 @@
                 <w:szCs w:val="28"/>
                 <w:lang w:val="uk-UA"/>
               </w:rPr>
-              <w:t>22</w:t>
+              <w:t>23</w:t>
             </w:r>
           </w:p>
         </w:tc>
@@ -2354,7 +2354,7 @@
                 <w:szCs w:val="28"/>
                 <w:lang w:val="uk-UA"/>
               </w:rPr>
-              <w:t>22</w:t>
+              <w:t>23</w:t>
             </w:r>
           </w:p>
         </w:tc>
@@ -2398,7 +2398,7 @@
                 <w:rFonts w:cs="Times New Roman"/>
                 <w:szCs w:val="28"/>
               </w:rPr>
-              <w:t>26</w:t>
+              <w:t>27</w:t>
             </w:r>
           </w:p>
         </w:tc>
@@ -2444,7 +2444,7 @@
                 <w:szCs w:val="28"/>
                 <w:lang w:val="uk-UA"/>
               </w:rPr>
-              <w:t>27</w:t>
+              <w:t>28</w:t>
             </w:r>
           </w:p>
         </w:tc>
@@ -2490,7 +2490,7 @@
                 <w:szCs w:val="28"/>
                 <w:lang w:val="uk-UA"/>
               </w:rPr>
-              <w:t>29</w:t>
+              <w:t>30</w:t>
             </w:r>
           </w:p>
         </w:tc>
@@ -2536,7 +2536,7 @@
                 <w:szCs w:val="28"/>
                 <w:lang w:val="uk-UA"/>
               </w:rPr>
-              <w:t>29</w:t>
+              <w:t>31</w:t>
             </w:r>
           </w:p>
         </w:tc>
@@ -2582,7 +2582,7 @@
                 <w:szCs w:val="28"/>
                 <w:lang w:val="uk-UA"/>
               </w:rPr>
-              <w:t>31</w:t>
+              <w:t>32</w:t>
             </w:r>
           </w:p>
         </w:tc>
@@ -2627,7 +2627,7 @@
                 <w:szCs w:val="28"/>
                 <w:lang w:val="uk-UA"/>
               </w:rPr>
-              <w:t>33</w:t>
+              <w:t>34</w:t>
             </w:r>
           </w:p>
         </w:tc>
@@ -2671,7 +2671,7 @@
                 <w:rFonts w:cs="Times New Roman"/>
                 <w:szCs w:val="28"/>
               </w:rPr>
-              <w:t>35</w:t>
+              <w:t>36</w:t>
             </w:r>
           </w:p>
         </w:tc>
@@ -2723,7 +2723,7 @@
                 <w:rFonts w:cs="Times New Roman"/>
                 <w:szCs w:val="28"/>
               </w:rPr>
-              <w:t>38</w:t>
+              <w:t>39</w:t>
             </w:r>
           </w:p>
         </w:tc>
@@ -3015,7 +3015,7 @@
         <w:rPr>
           <w:rFonts w:cs="Times New Roman"/>
         </w:rPr>
-        <w:t>Що? Програмний продукт являє собою гру «Сокобан» з двома режимами роботи: ручним проходженням рівнів користувачем та автоматичним пошуком розв’язку за допомогою алгоритмів BFS та A*. Програма завантажує рівні у стандартному текстовому форматі XSB, відображає ігрове поле, підтримує скасування ходів (Undo/Redo), анімацію знайденого розв’язку та виводить детальну статистику роботи алгоритмів: час пошуку, кількість досліджених станів, кількість ходів і штовхань.</w:t>
+        <w:t>Що? Програмний продукт являє собою гру «Сокобан» з двома режимами роботи: ручним проходженням рівнів користувачем та автоматичним пошуком розв’язку за допомогою дванадцяти алгоритмів: BFS, двох режимів A*, IDA*, Greedy, навчального X→Y, популяційних ACO, GA, Drain і Cannibal GA, біо-агента FlyBrain та зовнішнього ШІ. Програма завантажує рівні у стандартному текстовому форматі XSB, відображає ігрове поле, підтримує скасування ходів (Undo/Redo), анімацію знайденого розв’язку та виводить детальну статистику роботи алгоритмів: час пошуку, кількість досліджених станів, кількість ходів і штовхань із сортуванням рішень за часом, ходами та штовханнями.</w:t>
       </w:r>
     </w:p>
     <w:p>
@@ -3075,7 +3075,7 @@
         <w:rPr>
           <w:rFonts w:cs="Times New Roman"/>
         </w:rPr>
-        <w:t>Загальна архітектура програмної системи представлена на рисунку 1.1. Спільне ядро на мові C++20 реалізує правила гри та алгоритми пошуку, а три інтерфейси (термінальний CLI, Godot, Web) лише передають команди ядру та відображають отриманий стан. Такий підхід забезпечує однакову поведінку гри на всіх платформах і дозволяє тестувати алгоритми без запуску графічного інтерфейсу.</w:t>
+        <w:t>Загальна архітектура програмної системи представлена на рисунку 1.1. Спільне ядро на мові C++20 реалізує правила гри та алгоритми пошуку, а два інтерфейси (термінальний CLI та Web) лише передають команди ядру та відображають отриманий стан. Такий підхід забезпечує однакову поведінку гри на всіх платформах і дозволяє тестувати алгоритми без запуску графічного інтерфейсу.</w:t>
       </w:r>
     </w:p>
     <w:p>
@@ -3097,7 +3097,7 @@
         </w:rPr>
         <w:drawing>
           <wp:inline distT="0" distB="0" distL="0" distR="0" wp14:anchorId="6A0DB2A2" wp14:editId="2A8AEDFC">
-            <wp:extent cx="5580000" cy="3537291"/>
+            <wp:extent cx="5580000" cy="3255000"/>
             <wp:effectExtent l="0" t="0" r="0" b="0"/>
             <wp:docPr id="3" name="Picture 3"/>
             <wp:cNvGraphicFramePr>
@@ -3119,7 +3119,7 @@
                   <pic:spPr>
                     <a:xfrm>
                       <a:off x="0" y="0"/>
-                      <a:ext cx="5580000" cy="3537291"/>
+                      <a:ext cx="5580000" cy="3255000"/>
                     </a:xfrm>
                     <a:prstGeom prst="rect">
                       <a:avLst/>
@@ -3416,7 +3416,7 @@
         <w:rPr>
           <w:rFonts w:cs="Times New Roman"/>
         </w:rPr>
-        <w:t>5) в автоматичному режимі – запуск обраного алгоритму (BFS або A*) з поточного стану, збір статистики та відновлення послідовності ходів;</w:t>
+        <w:t>5) в автоматичному режимі – запуск обраного алгоритму (BFS, A*, IDA*, Greedy, прототипів, популяційних методів, FlyBrain або зовнішнього ШІ) з поточного стану, збір статистики та відновлення послідовності ходів;</w:t>
       </w:r>
     </w:p>
     <w:p>
@@ -5346,7 +5346,33 @@
         <w:rPr>
           <w:rFonts w:cs="Times New Roman"/>
         </w:rPr>
-        <w:t>Підтримуються дві метрики оптимізації: мінімум штовхань (кожне макроштовхання має вартість 1) та мінімум усіх рухів (вартість ребра дорівнює довжині найкоротшого маршруту гравця до позиції штовхання плюс саме штовхання). Блок-схему алгоритму A* наведено на рисунку 3.2.</w:t>
+        <w:t>Підтримуються дві метрики оптимізації: мінімум штовхань (кожне макроштовхання має вартість 1) та мінімум усіх рухів (вартість ребра дорівнює довжині найкоротшого маршруту гравця до позиції штовхання плюс саме штовхання). Блок-схему алгоритму A* наведено на рисунку 3.2. IDA* використовує ту саму допустиму евристику (зворотні push-відстані з угорським призначенням), тому також гарантує оптимальність, але зберігає лише поточну гілку пошуку.</w:t>
+      </w:r>
+    </w:p>
+    <w:p>
+      <w:pPr>
+        <w:ind w:firstLine="720"/>
+        <w:jc w:val="both"/>
+      </w:pPr>
+      <w:r>
+        <w:rPr>
+          <w:rFonts w:ascii="Times New Roman" w:hAnsi="Times New Roman"/>
+          <w:sz w:val="28"/>
+        </w:rPr>
+        <w:t>Алгоритм IDA* (ітеративне поглиблення A*) послідовно виконує пошук у глибину з порогом f = g + h, підвищуючи поріг до мінімального перевищеного значення. Завдяки цьому споживання пам’яті обмежене глибиною поточного шляху, а за допустимої евристики результат залишається оптимальним. Жадібний пошук (Greedy), навпаки, керується лише евристикою h без урахування накопиченої вартості g: він працює швидко, але оптимальності не гарантує, тому призначений для швидкої попередньої оцінки складності рівня.</w:t>
+      </w:r>
+    </w:p>
+    <w:p>
+      <w:pPr>
+        <w:ind w:firstLine="720"/>
+        <w:jc w:val="both"/>
+      </w:pPr>
+      <w:r>
+        <w:rPr>
+          <w:rFonts w:ascii="Times New Roman" w:hAnsi="Times New Roman"/>
+          <w:sz w:val="28"/>
+        </w:rPr>
+        <w:t>Навчальний прототип X→Y ігнорує стіни та показує базову ідею спрямованого руху без гарантій. Популяційні методи ACO (мурашині феромонні стежки), GA (еволюція хромосом), Drain (рельєф і струшування) та Cannibal GA (турніри з перенесенням ДНК) є стохастичними: вони ілюструють метаевристики й супроводжуються інтерактивним спостерігачем еволюції, але оптимальності не гарантують. Біо-агент FlyBrain (web-only LIF-мережа з 2004 нейронів) і зовнішній ШІ (моделі Groq або Google, план якого завжди перевіряється ядром через ReplayValidator) є допоміжними засобами; їхні маршрути застосовуються лише після успішної перевірки.</w:t>
       </w:r>
     </w:p>
     <w:p>
@@ -5525,7 +5551,7 @@
         <w:rPr>
           <w:rFonts w:cs="Times New Roman"/>
         </w:rPr>
-        <w:t>Висновок до пункту: для розв’язання гри «Сокобан» обрано комбінацію алгоритмів BFS та A* з макроштовханнями, зворотними push-відстанями, Угорським алгоритмом, безпечним Deadlock Detection та хешуванням Зобріста, що забезпечує повноту, оптимальність за обраною метрикою та високу практичну швидкодію.</w:t>
+        <w:t>Висновок до пункту: для розв’язання гри «Сокобан» обрано комбінацію алгоритмів BFS, A* та IDA* з макроштовханнями, зворотними push-відстанями, Угорським алгоритмом, безпечним Deadlock Detection та хешуванням Зобріста, що забезпечує повноту, оптимальність точних методів за обраною метрикою та високу практичну швидкодію, тоді як стохастичні методи та ШІ виконують допоміжну й навчальну роль.</w:t>
       </w:r>
     </w:p>
     <w:p>
@@ -6278,7 +6304,7 @@
         <w:rPr>
           <w:rFonts w:cs="Times New Roman"/>
         </w:rPr>
-        <w:t>Мова C++20 була обрана з таких причин: висока продуктивність, необхідна для пошуку в просторі станів із мільйонами вузлів; багата стандартна бібліотека STL, що надає всі необхідні структури даних (deque, priority_queue, unordered_map, vector); можливість компіляції ядра у WebAssembly для браузерної версії; підтримка об’єктно-орієнтованого програмування. Аргумент досвіду програмування також відіграє роль: C++ вивчається в межах дисциплін «Алгоритми та структури даних» та «Об’єктно-орієнтоване програмування».</w:t>
+        <w:t>Мова C++20 була обрана з таких причин: висока продуктивність, необхідна для пошуку в просторі станів із мільйонами вузлів; багата стандартна бібліотека STL, що надає всі необхідні структури даних (deque, priority_queue, unordered_map, vector); можливість використання ядра як нативного процесу-моста для браузерної версії; підтримка об’єктно-орієнтованого програмування. Аргумент досвіду програмування також відіграє роль: C++ вивчається в межах дисциплін «Алгоритми та структури даних» та «Об’єктно-орієнтоване програмування».</w:t>
       </w:r>
     </w:p>
     <w:p>
@@ -6290,7 +6316,7 @@
         <w:rPr>
           <w:rFonts w:cs="Times New Roman"/>
         </w:rPr>
-        <w:t>Система збирання – CMake, що забезпечує кросплатформену збірку. Термінальний інтерфейс реалізовано з використанням ANSI escape-послідовностей для кольорів та переміщення курсора; у Windows вмикається підтримка Virtual Terminal та кодова сторінка UTF-8. Браузерна версія реалізована на Next.js/React з WebAssembly-мостом, пошук виконується у Web Worker, щоб сторінка не зависала. Для тестування використано власний легкий фреймворк модульних тестів.</w:t>
+        <w:t>Система збирання – CMake, що забезпечує кросплатформену збірку. Термінальний інтерфейс реалізовано з використанням ANSI escape-послідовностей для кольорів та переміщення курсора; у Windows вмикається підтримка Virtual Terminal та кодова сторінка UTF-8. Браузерна версія реалізована на Next.js/React: пошук виконує нативний процес-міст sokoban_web (те саме C++-ядро, ізольований процес на запит, JSON через stdin/stdout), а біо-агент FlyBrain працює у Web Worker, щоб сторінка не зависала. Для тестування використано власний легкий фреймворк модульних тестів.</w:t>
       </w:r>
     </w:p>
     <w:p>
@@ -6427,7 +6453,7 @@
         <w:rPr>
           <w:rFonts w:cs="Times New Roman"/>
         </w:rPr>
-        <w:t>Програмна система складається зі спільного C++20-ядра та трьох інтерфейсів: термінального CLI, Godot-версії та браузерної Web-версії. Ядро містить класи Board (статичне поле), GameState (динамічний стан), GameRules (правила гри), GameSession (керування грою, історія, Undo/Redo), LevelParser (завантаження XSB-рівнів), BFSSolver та AStarSolver (алгоритми пошуку), DeadlockDetector (виявлення тупиків), Hungarian (Угорський алгоритм), Zobrist (хешування) та ReplayValidator (перевірка розв’язків).</w:t>
+        <w:t>Програмна система складається зі спільного C++20-ядра та двох інтерфейсів: термінального CLI і браузерної Web-версії. Ядро містить класи Board (статичне поле), GameState (динамічний стан), GameRules (правила гри), GameSession (керування грою, історія, Undo/Redo), LevelParser (завантаження XSB-рівнів), BFSSolver, AStarSolver, IDAStarSolver, GreedySolver, прототипи та популяційні розв’язувачі (реєстр SolverRegistry, загалом десять локальних алгоритмів), DeadlockDetector (виявлення тупиків), Hungarian (Угорський алгоритм), Zobrist (хешування) та ReplayValidator (перевірка розв’язків).</w:t>
       </w:r>
     </w:p>
     <w:p>
@@ -6893,7 +6919,7 @@
         <w:rPr>
           <w:rFonts w:cs="Times New Roman"/>
         </w:rPr>
-        <w:t>Висновок до пункту: програмна реалізація базових алгоритмів виконана з використанням об’єктно-орієнтованого підходу та необхідних структур даних: черги, деки, пріоритетної черги, хеш-таблиць, стеків і масивів.</w:t>
+        <w:t>Висновок до пункту: програмна реалізація базових алгоритмів виконана з використанням об’єктно-орієнтованого підходу та необхідних структур даних: черги, деки, пріоритетної черги, хеш-таблиць, стеків і масивів. Реєстр SolverRegistry надає десять локальних алгоритмів, а веб-інтерфейс доповнює їх біо-агентом FlyBrain і зовнішнім ШІ.</w:t>
       </w:r>
     </w:p>
     <w:p>
@@ -6939,7 +6965,7 @@
         <w:rPr>
           <w:rFonts w:cs="Times New Roman"/>
         </w:rPr>
-        <w:t>Для перевірки правильності реалізації використано власний фреймворк модульних тестів. Тестовий набір містить 72 тести, що охоплюють: правила гри (рух, штовхання, заборона штовхати два ящики, перемога), парсер XSB (валідація рівнів, помилки формату), Undo/Redo, алгоритми BFS та A* (оптимальність, ліміти, нерозв’язні рівні), виявлення тупиків (кути, блоки 2×2, мертві клітинки, призначення), генератор рівнів та порівняння алгоритмів. Усі 72 тести проходять успішно (72 Passed, 0 Failed).</w:t>
+        <w:t>Для перевірки правильності реалізації використано власний фреймворк модульних тестів. Тестовий набір ядра містить 79 тестів, що охоплюють: правила гри (рух, штовхання, заборона штовхати два ящики, перемога), парсер XSB (валідація рівнів, помилки формату), Undo/Redo, алгоритми BFS та A* (оптимальність, ліміти, нерозв’язні рівні), виявлення тупиків (кути, блоки 2×2, мертві клітинки, призначення), генератор рівнів та порівняння алгоритмів. Усі 79 тестів проходять успішно (79 Passed, 0 Failed); додатково 24 тести веб-моста (native.test.mjs, flybrain.test.mjs) перевіряють розв’язання всіх рівнів, повтори, генератор і біо-агента.</w:t>
       </w:r>
     </w:p>
     <w:p>
@@ -6951,7 +6977,7 @@
         <w:rPr>
           <w:rFonts w:cs="Times New Roman"/>
         </w:rPr>
-        <w:t>Функціональне тестування виконано на п’яти рівнях різної складності: 01_simple (1 ящик), 02_microban (1 ящик), 03_two_boxes (2 ящики), 04_warehouse (2 ящики), 05_triple (3 ящики). Для кожного рівня запускалися BFS (метрика Moves), A* (Moves) та A* (Pushes). Результати порівняння наведено в таблиці 3.1.</w:t>
+        <w:t>Функціональне тестування виконано на п’яти рівнях різної складності: 01_simple (1 ящик), 02_microban (1 ящик), 03_two_boxes (2 ящики), 04_warehouse (2 ящики), 05_triple (3 ящики). Третій слот інтерфейсу використовує файл 03_two_boxes.xsb; файл 03_microban_3.xsb навмисно нерозв’язний і використовується в негативному тесті. Для кожного рівня запускалися BFS (метрика Moves), A* (Moves) та A* (Pushes). Результати порівняння наведено в таблиці 3.1.</w:t>
       </w:r>
     </w:p>
     <w:p>
@@ -9393,7 +9419,7 @@
         <w:rPr>
           <w:rFonts w:cs="Times New Roman"/>
         </w:rPr>
-        <w:t>Керування в інтерактивній грі: WASD або стрілки – рух гравця та штовхання ящиків; U – скасування ходу (Undo); Y – повторення ходу (Redo); R – перезапуск рівня; H – підказка ШІ (перший хід A*); B / M / P – розв’язати алгоритмами BFS / A* Moves / A* Pushes; T – порівняти всі алгоритми з поточної позиції; пробіл – пауза/продовження відтворення; N – один крок розв’язку; Q або Esc – вихід.</w:t>
+        <w:t>Керування в інтерактивній грі: WASD або стрілки – рух гравця та штовхання ящиків; U – скасування ходу (Undo); Y – повторення ходу (Redo); R – перезапуск рівня; H – підказка ШІ (перший хід A*); B / M / P – розв’язати алгоритмами BFS / A* Moves / A* Pushes; I / O / X – IDA*, Greedy та прототип X→Y; G – зовнішній ШІ; K – введення API-ключа; T – порівняти всі алгоритми з поточної позиції; пробіл – пауза/продовження відтворення; N – один крок розв’язку; Q або Esc – вихід.</w:t>
       </w:r>
     </w:p>
     <w:p>
@@ -9405,7 +9431,20 @@
         <w:rPr>
           <w:rFonts w:cs="Times New Roman"/>
         </w:rPr>
-        <w:t>Браузерна версія запускається командою npm run dev у каталозі web та відкривається за адресою http://localhost:3000. Вона надає вибір рівнів, ручну гру з клавіатурою, покрокове відтворення рішень ШІ та інтерактивні навчальні візуалізації алгоритмів.</w:t>
+        <w:t>Браузерна версія запускається командою npm run dev у каталозі web та відкривається за адресою http://localhost:3000. Вона надає вибір п’яти рівнів (Рівень 1 – Рівень 5) і генератора власних карт (/levels/create: поле 5–100 клітинок, 1–50 ящиків, точна кількість стін, seed), ручну гру з клавіатурою, камеру для полів понад 22 клітинки, покрокове відтворення рішень, сторінку налаштування ключа ШІ (/ai, Groq або Google) та інтерактивні навчальні візуалізації алгоритмів (/about).</w:t>
+      </w:r>
+    </w:p>
+    <w:p>
+      <w:pPr>
+        <w:ind w:firstLine="720"/>
+        <w:jc w:val="both"/>
+      </w:pPr>
+      <w:r>
+        <w:rPr>
+          <w:rFonts w:ascii="Times New Roman" w:hAnsi="Times New Roman"/>
+          <w:sz w:val="28"/>
+        </w:rPr>
+        <w:t>Список алгоритмів в інтерфейсі пронумеровано від 1 до 12 (BFS, два режими A*, IDA*, Greedy, X→Y, ACO, GA, Drain, Cannibal GA, FlyBrain, зовнішній ШІ) без дублювання метрики в назві; картки рішень показують час, досліджені стани, ходи та штовхання й сортуються за часом, ходами або штовханнями. Доступні порівняння всіх алгоритмів із поточної позиції та вибіркове порівняння поруч із синхронним відтворенням.</w:t>
       </w:r>
     </w:p>
     <w:p>
@@ -9516,7 +9555,7 @@
         <w:rPr>
           <w:rFonts w:cs="Times New Roman"/>
         </w:rPr>
-        <w:t>Виконано аналіз предметної області гри «Сокобан», формалізовано правила гри та стан системи, сформульовано постановку задачі у вигляді структурованого списку вимог та загальний алгоритм роботи програми. Проведено аналіз аналогів, який показав відсутність готових рішень, що поєднують ручну гру, автоматичний пошук двома алгоритмами, детальну статистику та навчальну візуалізацію.</w:t>
+        <w:t>Виконано аналіз предметної області гри «Сокобан», формалізовано правила гри та стан системи, сформульовано постановку задачі у вигляді структурованого списку вимог та загальний алгоритм роботи програми. Проведено аналіз аналогів, який показав відсутність готових рішень, що поєднують ручну гру, автоматичний пошук дванадцятьма алгоритмами, детальну статистику та навчальну візуалізацію.</w:t>
       </w:r>
     </w:p>
     <w:p>
@@ -9528,7 +9567,7 @@
         <w:rPr>
           <w:rFonts w:cs="Times New Roman"/>
         </w:rPr>
-        <w:t>Розроблено два алгоритми розв’язання задачі: алгоритм пошуку в ширину (BFS), що гарантує мінімальну кількість ходів на невеликих рівнях, та евристичний алгоритм A* з макроштовханнями, зворотними push-відстанями, мінімальним призначенням ящиків цілям за допомогою Угорського алгоритму та безпечним виявленням тупикових станів. Оцінено часову та просторову складність алгоритмів: BFS має складність O(V + E) за часом і O(V) за пам’яттю, A* у найгіршому випадку також експоненційний, але завдяки евристиці та відсіканню тупиків досліджує на 1–2 порядки менше станів.</w:t>
+        <w:t>Розроблено базові алгоритми розв’язання задачі – пошук у ширину (BFS), що гарантує мінімальну кількість ходів на невеликих рівнях, та евристичний A* з макроштовханнями, зворотними push-відстанями, мінімальним призначенням ящиків цілям за допомогою Угорського алгоритму та безпечним виявленням тупикових станів. Оцінено часову та просторову складність алгоритмів: BFS має складність O(V + E) за часом і O(V) за пам’яттю, A* у найгіршому випадку також експоненційний, але завдяки евристиці та відсіканню тупиків досліджує на 1–2 порядки менше станів. До реєстру також входять IDA* (оптимальний, мало пам’яті), жадібний пошук, прототип X→Y, популяційні ACO, GA, Drain і Cannibal GA, а веб-інтерфейс надає біо-агента FlyBrain і зовнішній ШІ.</w:t>
       </w:r>
     </w:p>
     <w:p>
@@ -9552,7 +9591,7 @@
         <w:rPr>
           <w:rFonts w:cs="Times New Roman"/>
         </w:rPr>
-        <w:t>Тестування підтвердило коректність реалізації: усі 72 модульні тести проходять успішно, знайдені розв’язки проходять повторну перевірку ReplayValidator. Експериментальне порівняння на контрольних рівнях показало, що A* досліджує значно менше станів, ніж BFS, зберігаючи оптимальність за обраною метрикою.</w:t>
+        <w:t>Тестування підтвердило коректність реалізації: усі 79 модульних тестів ядра проходять успішно (додатково 24 тести веб-моста), знайдені розв’язки проходять повторну перевірку ReplayValidator. Експериментальне порівняння на контрольних рівнях показало, що A* досліджує значно менше станів, ніж BFS, зберігаючи оптимальність за обраною метрикою.</w:t>
       </w:r>
     </w:p>
     <w:p>
@@ -9576,7 +9615,7 @@
         <w:rPr>
           <w:rFonts w:cs="Times New Roman"/>
         </w:rPr>
-        <w:t>Результати курсової роботи можуть використовуватися в навчальному процесі для вивчення алгоритмів пошуку в просторі станів, а також як основа для подальших досліджень: додавання алгоритму IDA*, pattern database, навчуваних евристик, інтеграції зовнішніх AI-сервісів та розширення набору рівнів.</w:t>
+        <w:t>Результати курсової роботи можуть використовуватися в навчальному процесі для вивчення алгоритмів пошуку в просторі станів, а також як основа для подальших досліджень: pattern database, навчувані евристики та розширення набору рівнів.</w:t>
       </w:r>
     </w:p>
     <w:p>
@@ -12282,7 +12321,7 @@
         <w:rPr>
           <w:rFonts w:cs="Times New Roman"/>
         </w:rPr>
-        <w:t>На рисунку Б.1 наведено діаграму класів програмної системи «Сокобан». Ядро містить класи Board, GameState, GameRules, GameSession та LevelParser; алгоритми пошуку реалізують спільний інтерфейс ISolver; допоміжні класи Hungarian, Zobrist та DeadlockDetector забезпечують евристику, хешування та відсікання тупиків.</w:t>
+        <w:t>На рисунку Б.1 наведено діаграму класів програмної системи «Сокобан». Ядро містить класи Board, GameState, GameRules, GameSession та LevelParser; алгоритми пошуку реалізують спільний інтерфейс ISolver; допоміжні класи Hungarian, Zobrist та DeadlockDetector забезпечують евристику, хешування та відсікання тупиків. Реєстр SolverRegistry надає десять локальних розв’язувачів через спільний інтерфейс ISolver.</w:t>
       </w:r>
     </w:p>
     <w:p>
@@ -12491,7 +12530,7 @@
         </w:rPr>
         <w:drawing>
           <wp:inline distT="0" distB="0" distL="0" distR="0" wp14:anchorId="78FC992B" wp14:editId="216AA5F5">
-            <wp:extent cx="4572000" cy="2846958"/>
+            <wp:extent cx="4572000" cy="2767263"/>
             <wp:effectExtent l="0" t="0" r="0" b="0"/>
             <wp:docPr id="8" name="Picture 8"/>
             <wp:cNvGraphicFramePr>
@@ -12513,7 +12552,7 @@
                   <pic:spPr>
                     <a:xfrm>
                       <a:off x="0" y="0"/>
-                      <a:ext cx="4572000" cy="2846958"/>
+                      <a:ext cx="4572000" cy="2767263"/>
                     </a:xfrm>
                     <a:prstGeom prst="rect">
                       <a:avLst/>
@@ -12565,7 +12604,7 @@
           <w:rFonts w:cs="Times New Roman"/>
           <w:color w:val="000000"/>
         </w:rPr>
-        <w:t>Діаграма охоплює ручну гру (Manual), підказку (Hint), покрокове виконання (AI Step), автоматичне відтворення (Autoplay) та порівняння алгоритмів (Compare).</w:t>
+        <w:t>Діаграма охоплює стани «Ручна гра», «Підказка», «Розв’язок знайдено», «Симуляція», «Пауза», «Покроково», «Порівняння ШІ» та «Рівень розв’язано», а також початковий і кінцевий стани.</w:t>
       </w:r>
     </w:p>
     <w:sectPr>

</xml_diff>